<commit_message>
Is Paketleri tablosundaki bos hucrelerde tire (--) kullanimi kaldirildi
Baslangic tarihi olmayan 3 kilometre tasi satirinda (Teknik Rapor Teslimi,
Rapor Sonuclari, Canli Sunum) tire yerine hucre tamamen bos birakildi.
Belgede artik hic em-dash yok (0), kalan 4 en-dash da yalnizca me?ru
kullanimlarda (proje adi ayraci, kaynakca sayfa araligi 6174-6184).

Co-Authored-By: Claude Sonnet 5 <noreply@anthropic.com>
Claude-Session: https://claude.ai/code/session_016oT2ZRfrho95YiGP8j4AAp
</commit_message>
<xml_diff>
--- a/NSosyal_Inovasyon_2026_-_Proje_Teknik_Raporu_1_u6IVb.docx
+++ b/NSosyal_Inovasyon_2026_-_Proje_Teknik_Raporu_1_u6IVb.docx
@@ -2389,7 +2389,7 @@
               <w:rPr>
                 <w:sz w:val="18"/>
               </w:rPr>
-              <w:t>—</w:t>
+              <w:t/>
             </w:r>
           </w:p>
         </w:tc>
@@ -2487,7 +2487,7 @@
               <w:rPr>
                 <w:sz w:val="18"/>
               </w:rPr>
-              <w:t>—</w:t>
+              <w:t/>
             </w:r>
           </w:p>
         </w:tc>
@@ -2781,7 +2781,7 @@
               <w:rPr>
                 <w:sz w:val="18"/>
               </w:rPr>
-              <w:t>—</w:t>
+              <w:t/>
             </w:r>
           </w:p>
         </w:tc>

</xml_diff>